<commit_message>
Changed the logo and resume content
</commit_message>
<xml_diff>
--- a/public/gilbert-resume.docx
+++ b/public/gilbert-resume.docx
@@ -39,108 +39,9 @@
           <w:sz w:val="21"/>
           <w:szCs w:val="21"/>
         </w:rPr>
-        <w:t>General Tinio</w:t>
-      </w:r>
-      <w:r>
-        <w:rPr>
-          <w:rFonts w:ascii="Garamond" w:eastAsia="Garamond" w:hAnsi="Garamond" w:cs="Garamond"/>
-          <w:sz w:val="21"/>
-          <w:szCs w:val="21"/>
-        </w:rPr>
-        <w:t xml:space="preserve">, </w:t>
-      </w:r>
-      <w:r>
-        <w:rPr>
-          <w:rFonts w:ascii="Garamond" w:eastAsia="Garamond" w:hAnsi="Garamond" w:cs="Garamond"/>
-          <w:sz w:val="21"/>
-          <w:szCs w:val="21"/>
-        </w:rPr>
-        <w:t>Nueva Ecija</w:t>
-      </w:r>
-      <w:r>
-        <w:rPr>
-          <w:rFonts w:ascii="Garamond" w:eastAsia="Garamond" w:hAnsi="Garamond" w:cs="Garamond"/>
-          <w:sz w:val="21"/>
-          <w:szCs w:val="21"/>
-        </w:rPr>
-        <w:t xml:space="preserve"> | +63 9</w:t>
-      </w:r>
-      <w:r>
-        <w:rPr>
-          <w:rFonts w:ascii="Garamond" w:eastAsia="Garamond" w:hAnsi="Garamond" w:cs="Garamond"/>
-          <w:sz w:val="21"/>
-          <w:szCs w:val="21"/>
-        </w:rPr>
-        <w:t>81</w:t>
-      </w:r>
-      <w:r>
-        <w:rPr>
-          <w:rFonts w:ascii="Garamond" w:eastAsia="Garamond" w:hAnsi="Garamond" w:cs="Garamond"/>
-          <w:sz w:val="21"/>
-          <w:szCs w:val="21"/>
-        </w:rPr>
-        <w:t xml:space="preserve"> </w:t>
-      </w:r>
-      <w:r>
-        <w:rPr>
-          <w:rFonts w:ascii="Garamond" w:eastAsia="Garamond" w:hAnsi="Garamond" w:cs="Garamond"/>
-          <w:sz w:val="21"/>
-          <w:szCs w:val="21"/>
-        </w:rPr>
-        <w:t>517</w:t>
-      </w:r>
-      <w:r>
-        <w:rPr>
-          <w:rFonts w:ascii="Garamond" w:eastAsia="Garamond" w:hAnsi="Garamond" w:cs="Garamond"/>
-          <w:sz w:val="21"/>
-          <w:szCs w:val="21"/>
-        </w:rPr>
-        <w:t xml:space="preserve"> </w:t>
-      </w:r>
-      <w:r>
-        <w:rPr>
-          <w:rFonts w:ascii="Garamond" w:eastAsia="Garamond" w:hAnsi="Garamond" w:cs="Garamond"/>
-          <w:sz w:val="21"/>
-          <w:szCs w:val="21"/>
-        </w:rPr>
-        <w:t>0381</w:t>
-      </w:r>
-      <w:r>
-        <w:rPr>
-          <w:rFonts w:ascii="Garamond" w:eastAsia="Garamond" w:hAnsi="Garamond" w:cs="Garamond"/>
-          <w:sz w:val="21"/>
-          <w:szCs w:val="21"/>
-        </w:rPr>
-        <w:t xml:space="preserve"> | </w:t>
-      </w:r>
-      <w:proofErr w:type="gramStart"/>
-      <w:r>
-        <w:rPr>
-          <w:rFonts w:ascii="Garamond" w:eastAsia="Garamond" w:hAnsi="Garamond" w:cs="Garamond"/>
-          <w:sz w:val="21"/>
-          <w:szCs w:val="21"/>
-        </w:rPr>
-        <w:t>gilbertstamaria58</w:t>
-      </w:r>
-      <w:r>
-        <w:rPr>
-          <w:rFonts w:ascii="Garamond" w:eastAsia="Garamond" w:hAnsi="Garamond" w:cs="Garamond"/>
-          <w:sz w:val="21"/>
-          <w:szCs w:val="21"/>
-        </w:rPr>
-        <w:t>@gmail.com  |</w:t>
-      </w:r>
-      <w:proofErr w:type="gramEnd"/>
-      <w:r>
-        <w:rPr>
-          <w:rFonts w:ascii="Garamond" w:eastAsia="Garamond" w:hAnsi="Garamond" w:cs="Garamond"/>
-          <w:sz w:val="21"/>
-          <w:szCs w:val="21"/>
-        </w:rPr>
-        <w:t xml:space="preserve">  linkedin.com/in/</w:t>
+        <w:t>General Tinio, Nueva Ecija | +63 981 517 0381 | gilbertstamaria58@gmail.com | linkedin.com/in/</w:t>
       </w:r>
       <w:proofErr w:type="spellStart"/>
-      <w:proofErr w:type="gramStart"/>
       <w:r>
         <w:rPr>
           <w:rFonts w:ascii="Garamond" w:eastAsia="Garamond" w:hAnsi="Garamond" w:cs="Garamond"/>
@@ -156,16 +57,7 @@
           <w:sz w:val="21"/>
           <w:szCs w:val="21"/>
         </w:rPr>
-        <w:t xml:space="preserve">  |</w:t>
-      </w:r>
-      <w:proofErr w:type="gramEnd"/>
-      <w:r>
-        <w:rPr>
-          <w:rFonts w:ascii="Garamond" w:eastAsia="Garamond" w:hAnsi="Garamond" w:cs="Garamond"/>
-          <w:sz w:val="21"/>
-          <w:szCs w:val="21"/>
-        </w:rPr>
-        <w:t xml:space="preserve">  github.com/</w:t>
+        <w:t xml:space="preserve"> | github.com/</w:t>
       </w:r>
       <w:proofErr w:type="spellStart"/>
       <w:r>
@@ -285,13 +177,6 @@
           <w:szCs w:val="21"/>
         </w:rPr>
         <w:tab/>
-      </w:r>
-      <w:r>
-        <w:rPr>
-          <w:rFonts w:ascii="Garamond" w:eastAsia="Garamond" w:hAnsi="Garamond" w:cs="Garamond"/>
-          <w:sz w:val="21"/>
-          <w:szCs w:val="21"/>
-        </w:rPr>
         <w:t>General Tinio, Nueva Ecija</w:t>
       </w:r>
     </w:p>
@@ -412,7 +297,16 @@
           <w:sz w:val="21"/>
           <w:szCs w:val="21"/>
         </w:rPr>
-        <w:t>General Weighted Average (GWA): 1.50 / 1.00 (Cum Laude); Dean’s Lister, 2021–2024</w:t>
+        <w:t>General Weighted Average (GWA): 1.</w:t>
+      </w:r>
+      <w:r>
+        <w:rPr>
+          <w:rFonts w:ascii="Garamond" w:eastAsia="Garamond" w:hAnsi="Garamond" w:cs="Garamond"/>
+          <w:color w:val="000000"/>
+          <w:sz w:val="21"/>
+          <w:szCs w:val="21"/>
+        </w:rPr>
+        <w:t>78</w:t>
       </w:r>
     </w:p>
     <w:p>
@@ -536,16 +430,7 @@
           <w:sz w:val="21"/>
           <w:szCs w:val="21"/>
         </w:rPr>
-        <w:t xml:space="preserve">TECHSTART SOLUTIONS </w:t>
-      </w:r>
-      <w:r>
-        <w:rPr>
-          <w:rFonts w:ascii="Garamond" w:eastAsia="Garamond" w:hAnsi="Garamond" w:cs="Garamond"/>
-          <w:color w:val="404040"/>
-          <w:sz w:val="21"/>
-          <w:szCs w:val="21"/>
-        </w:rPr>
-        <w:t>(early-stage fintech startup)</w:t>
+        <w:t>ELGA FASHION SHOP</w:t>
       </w:r>
       <w:r>
         <w:rPr>
@@ -554,7 +439,7 @@
           <w:szCs w:val="21"/>
         </w:rPr>
         <w:tab/>
-        <w:t>BGC, Taguig</w:t>
+        <w:t>Cabanatuan, Nueva Ecija</w:t>
       </w:r>
     </w:p>
     <w:p>
@@ -575,7 +460,23 @@
           <w:sz w:val="21"/>
           <w:szCs w:val="21"/>
         </w:rPr>
-        <w:t>Junior Software Engineer</w:t>
+        <w:t>Admin</w:t>
+      </w:r>
+      <w:r>
+        <w:rPr>
+          <w:rFonts w:ascii="Garamond" w:eastAsia="Garamond" w:hAnsi="Garamond" w:cs="Garamond"/>
+          <w:sz w:val="21"/>
+          <w:szCs w:val="21"/>
+        </w:rPr>
+        <w:t>istrative Asistant</w:t>
+      </w:r>
+      <w:r>
+        <w:rPr>
+          <w:rFonts w:ascii="Garamond" w:eastAsia="Garamond" w:hAnsi="Garamond" w:cs="Garamond"/>
+          <w:sz w:val="21"/>
+          <w:szCs w:val="21"/>
+        </w:rPr>
+        <w:t xml:space="preserve"> / Data Encoder</w:t>
       </w:r>
       <w:r>
         <w:rPr>
@@ -584,7 +485,7 @@
           <w:szCs w:val="21"/>
         </w:rPr>
         <w:tab/>
-        <w:t>Jan 2024 – Present</w:t>
+        <w:t>July 2025 – Present</w:t>
       </w:r>
     </w:p>
     <w:p>
@@ -616,10 +517,52 @@
       <w:r>
         <w:rPr>
           <w:rFonts w:ascii="Garamond" w:eastAsia="Garamond" w:hAnsi="Garamond" w:cs="Garamond"/>
-          <w:sz w:val="21"/>
-          <w:szCs w:val="21"/>
-        </w:rPr>
-        <w:t>Built and shipped REST APIs in Laravel and Node.js serving 50,000+ daily active users, cutting average response time by 40%</w:t>
+          <w:color w:val="000000"/>
+          <w:sz w:val="21"/>
+          <w:szCs w:val="21"/>
+        </w:rPr>
+        <w:t xml:space="preserve">Assisted with daily administrative tasks, data management and other office operations to support efficient </w:t>
+      </w:r>
+    </w:p>
+    <w:p>
+      <w:pPr>
+        <w:pBdr>
+          <w:top w:val="nil"/>
+          <w:left w:val="nil"/>
+          <w:bottom w:val="nil"/>
+          <w:right w:val="nil"/>
+          <w:between w:val="nil"/>
+        </w:pBdr>
+        <w:tabs>
+          <w:tab w:val="left" w:pos="284"/>
+          <w:tab w:val="left" w:pos="630"/>
+          <w:tab w:val="left" w:pos="900"/>
+        </w:tabs>
+        <w:ind w:left="284"/>
+        <w:rPr>
+          <w:rFonts w:ascii="Garamond" w:eastAsia="Garamond" w:hAnsi="Garamond" w:cs="Garamond"/>
+          <w:color w:val="000000"/>
+          <w:sz w:val="21"/>
+          <w:szCs w:val="21"/>
+        </w:rPr>
+      </w:pPr>
+      <w:r>
+        <w:rPr>
+          <w:rFonts w:ascii="Garamond" w:eastAsia="Garamond" w:hAnsi="Garamond" w:cs="Garamond"/>
+          <w:color w:val="000000"/>
+          <w:sz w:val="21"/>
+          <w:szCs w:val="21"/>
+        </w:rPr>
+        <w:t>business processes</w:t>
+      </w:r>
+      <w:r>
+        <w:rPr>
+          <w:rFonts w:ascii="Garamond" w:eastAsia="Garamond" w:hAnsi="Garamond" w:cs="Garamond"/>
+          <w:color w:val="000000"/>
+          <w:sz w:val="21"/>
+          <w:szCs w:val="21"/>
+        </w:rPr>
+        <w:t>.</w:t>
       </w:r>
     </w:p>
     <w:p>
@@ -654,7 +597,7 @@
           <w:sz w:val="21"/>
           <w:szCs w:val="21"/>
         </w:rPr>
-        <w:t>Developed responsive front-end features in React and Tailwind CSS, increasing sign-up conversion by 25%</w:t>
+        <w:t>Organized digital and physical documents, spreadsheets, and reports to ensure information was accessible and up to date.</w:t>
       </w:r>
     </w:p>
     <w:p>
@@ -686,28 +629,510 @@
       <w:r>
         <w:rPr>
           <w:rFonts w:ascii="Garamond" w:eastAsia="Garamond" w:hAnsi="Garamond" w:cs="Garamond"/>
-          <w:sz w:val="21"/>
-          <w:szCs w:val="21"/>
-        </w:rPr>
-        <w:t>Wrote unit and integration tests (</w:t>
-      </w:r>
-      <w:proofErr w:type="spellStart"/>
-      <w:r>
-        <w:rPr>
-          <w:rFonts w:ascii="Garamond" w:eastAsia="Garamond" w:hAnsi="Garamond" w:cs="Garamond"/>
-          <w:sz w:val="21"/>
-          <w:szCs w:val="21"/>
-        </w:rPr>
-        <w:t>PHPUnit</w:t>
-      </w:r>
-      <w:proofErr w:type="spellEnd"/>
-      <w:r>
-        <w:rPr>
-          <w:rFonts w:ascii="Garamond" w:eastAsia="Garamond" w:hAnsi="Garamond" w:cs="Garamond"/>
-          <w:sz w:val="21"/>
-          <w:szCs w:val="21"/>
-        </w:rPr>
-        <w:t>, Jest), raising code coverage from 40% to 85% and reducing production bugs</w:t>
+          <w:color w:val="000000"/>
+          <w:sz w:val="21"/>
+          <w:szCs w:val="21"/>
+        </w:rPr>
+        <w:t>Communicated with customers and team members to clarify information, address concerns, and ensure smooth completion of transactions.</w:t>
+      </w:r>
+    </w:p>
+    <w:p>
+      <w:pPr>
+        <w:pBdr>
+          <w:bottom w:val="single" w:sz="6" w:space="1" w:color="000000"/>
+        </w:pBdr>
+        <w:tabs>
+          <w:tab w:val="left" w:pos="900"/>
+        </w:tabs>
+        <w:rPr>
+          <w:rFonts w:ascii="Garamond" w:eastAsia="Garamond" w:hAnsi="Garamond" w:cs="Garamond"/>
+          <w:color w:val="404040"/>
+          <w:sz w:val="21"/>
+          <w:szCs w:val="21"/>
+        </w:rPr>
+      </w:pPr>
+    </w:p>
+    <w:p>
+      <w:pPr>
+        <w:pBdr>
+          <w:bottom w:val="single" w:sz="6" w:space="1" w:color="000000"/>
+        </w:pBdr>
+        <w:tabs>
+          <w:tab w:val="left" w:pos="900"/>
+        </w:tabs>
+        <w:rPr>
+          <w:rFonts w:ascii="Garamond" w:eastAsia="Garamond" w:hAnsi="Garamond" w:cs="Garamond"/>
+          <w:sz w:val="21"/>
+          <w:szCs w:val="21"/>
+        </w:rPr>
+      </w:pPr>
+      <w:r>
+        <w:rPr>
+          <w:rFonts w:ascii="Garamond" w:eastAsia="Garamond" w:hAnsi="Garamond" w:cs="Garamond"/>
+          <w:b/>
+          <w:bCs/>
+          <w:color w:val="404040"/>
+          <w:sz w:val="22"/>
+          <w:szCs w:val="22"/>
+        </w:rPr>
+        <w:t>PROJECTS</w:t>
+      </w:r>
+      <w:r>
+        <w:rPr>
+          <w:rFonts w:ascii="Garamond" w:eastAsia="Garamond" w:hAnsi="Garamond" w:cs="Garamond"/>
+          <w:sz w:val="21"/>
+          <w:szCs w:val="21"/>
+        </w:rPr>
+        <w:tab/>
+      </w:r>
+    </w:p>
+    <w:p>
+      <w:pPr>
+        <w:tabs>
+          <w:tab w:val="left" w:pos="900"/>
+        </w:tabs>
+        <w:rPr>
+          <w:rFonts w:ascii="Garamond" w:eastAsia="Garamond" w:hAnsi="Garamond" w:cs="Garamond"/>
+          <w:color w:val="404040"/>
+          <w:sz w:val="4"/>
+          <w:szCs w:val="4"/>
+        </w:rPr>
+      </w:pPr>
+    </w:p>
+    <w:p>
+      <w:pPr>
+        <w:tabs>
+          <w:tab w:val="left" w:pos="900"/>
+        </w:tabs>
+        <w:rPr>
+          <w:rFonts w:ascii="Garamond" w:eastAsia="Garamond" w:hAnsi="Garamond" w:cs="Garamond"/>
+          <w:color w:val="404040"/>
+          <w:sz w:val="6"/>
+          <w:szCs w:val="6"/>
+        </w:rPr>
+      </w:pPr>
+    </w:p>
+    <w:p>
+      <w:pPr>
+        <w:tabs>
+          <w:tab w:val="left" w:pos="1134"/>
+          <w:tab w:val="right" w:pos="10503"/>
+        </w:tabs>
+        <w:rPr>
+          <w:rFonts w:ascii="Garamond" w:eastAsia="Garamond" w:hAnsi="Garamond" w:cs="Garamond"/>
+          <w:b/>
+          <w:bCs/>
+          <w:sz w:val="21"/>
+          <w:szCs w:val="21"/>
+        </w:rPr>
+      </w:pPr>
+      <w:r>
+        <w:rPr>
+          <w:rFonts w:ascii="Garamond" w:eastAsia="Garamond" w:hAnsi="Garamond" w:cs="Garamond"/>
+          <w:b/>
+          <w:bCs/>
+          <w:sz w:val="21"/>
+          <w:szCs w:val="21"/>
+        </w:rPr>
+        <w:t>Elga Order Management System</w:t>
+      </w:r>
+      <w:r>
+        <w:rPr>
+          <w:rFonts w:ascii="Garamond" w:eastAsia="Garamond" w:hAnsi="Garamond" w:cs="Garamond"/>
+          <w:b/>
+          <w:bCs/>
+          <w:sz w:val="21"/>
+          <w:szCs w:val="21"/>
+        </w:rPr>
+        <w:tab/>
+      </w:r>
+      <w:r>
+        <w:rPr>
+          <w:rFonts w:ascii="Garamond" w:eastAsia="Garamond" w:hAnsi="Garamond" w:cs="Garamond"/>
+          <w:sz w:val="21"/>
+          <w:szCs w:val="21"/>
+        </w:rPr>
+        <w:t>2026</w:t>
+      </w:r>
+    </w:p>
+    <w:p>
+      <w:pPr>
+        <w:numPr>
+          <w:ilvl w:val="0"/>
+          <w:numId w:val="1"/>
+        </w:numPr>
+        <w:tabs>
+          <w:tab w:val="left" w:pos="284"/>
+          <w:tab w:val="left" w:pos="630"/>
+          <w:tab w:val="left" w:pos="900"/>
+        </w:tabs>
+        <w:ind w:left="284" w:hanging="270"/>
+        <w:rPr>
+          <w:rFonts w:ascii="Garamond" w:eastAsia="Garamond" w:hAnsi="Garamond" w:cs="Garamond"/>
+          <w:sz w:val="21"/>
+          <w:szCs w:val="21"/>
+        </w:rPr>
+      </w:pPr>
+      <w:r>
+        <w:rPr>
+          <w:rFonts w:ascii="Garamond" w:eastAsia="Garamond" w:hAnsi="Garamond" w:cs="Garamond"/>
+          <w:sz w:val="21"/>
+          <w:szCs w:val="21"/>
+        </w:rPr>
+        <w:t xml:space="preserve">Developing a web-based order management system for a fashion retail business to centralize orders, payments, </w:t>
+      </w:r>
+    </w:p>
+    <w:p>
+      <w:pPr>
+        <w:tabs>
+          <w:tab w:val="left" w:pos="284"/>
+          <w:tab w:val="left" w:pos="630"/>
+          <w:tab w:val="left" w:pos="900"/>
+        </w:tabs>
+        <w:ind w:left="284"/>
+        <w:rPr>
+          <w:rFonts w:ascii="Garamond" w:eastAsia="Garamond" w:hAnsi="Garamond" w:cs="Garamond"/>
+          <w:sz w:val="21"/>
+          <w:szCs w:val="21"/>
+        </w:rPr>
+      </w:pPr>
+      <w:r>
+        <w:rPr>
+          <w:rFonts w:ascii="Garamond" w:eastAsia="Garamond" w:hAnsi="Garamond" w:cs="Garamond"/>
+          <w:sz w:val="21"/>
+          <w:szCs w:val="21"/>
+        </w:rPr>
+        <w:t>shipping, and sales reporting.</w:t>
+      </w:r>
+    </w:p>
+    <w:p>
+      <w:pPr>
+        <w:numPr>
+          <w:ilvl w:val="0"/>
+          <w:numId w:val="1"/>
+        </w:numPr>
+        <w:tabs>
+          <w:tab w:val="left" w:pos="284"/>
+          <w:tab w:val="left" w:pos="630"/>
+          <w:tab w:val="left" w:pos="900"/>
+        </w:tabs>
+        <w:ind w:left="284" w:hanging="270"/>
+        <w:rPr>
+          <w:rFonts w:ascii="Garamond" w:eastAsia="Garamond" w:hAnsi="Garamond" w:cs="Garamond"/>
+          <w:sz w:val="21"/>
+          <w:szCs w:val="21"/>
+        </w:rPr>
+      </w:pPr>
+      <w:r>
+        <w:rPr>
+          <w:rFonts w:ascii="Garamond" w:eastAsia="Garamond" w:hAnsi="Garamond" w:cs="Garamond"/>
+          <w:sz w:val="21"/>
+          <w:szCs w:val="21"/>
+        </w:rPr>
+        <w:t>Designed to reduce manual data entry and improve the efficiency and organization of daily order operations.</w:t>
+      </w:r>
+    </w:p>
+    <w:p>
+      <w:pPr>
+        <w:numPr>
+          <w:ilvl w:val="0"/>
+          <w:numId w:val="1"/>
+        </w:numPr>
+        <w:tabs>
+          <w:tab w:val="left" w:pos="284"/>
+          <w:tab w:val="left" w:pos="630"/>
+          <w:tab w:val="left" w:pos="900"/>
+        </w:tabs>
+        <w:ind w:left="284" w:hanging="270"/>
+        <w:rPr>
+          <w:rFonts w:ascii="Garamond" w:eastAsia="Garamond" w:hAnsi="Garamond" w:cs="Garamond"/>
+          <w:sz w:val="21"/>
+          <w:szCs w:val="21"/>
+        </w:rPr>
+      </w:pPr>
+      <w:r>
+        <w:rPr>
+          <w:rFonts w:ascii="Garamond" w:eastAsia="Garamond" w:hAnsi="Garamond" w:cs="Garamond"/>
+          <w:sz w:val="21"/>
+          <w:szCs w:val="21"/>
+        </w:rPr>
+        <w:t>Built using Laravel, React.js, Inertia.js, MySQL, and Tailwind CSS, with role-based access and business workflow management.</w:t>
+      </w:r>
+    </w:p>
+    <w:p>
+      <w:pPr>
+        <w:tabs>
+          <w:tab w:val="left" w:pos="284"/>
+          <w:tab w:val="left" w:pos="630"/>
+          <w:tab w:val="left" w:pos="900"/>
+        </w:tabs>
+        <w:ind w:left="14"/>
+        <w:rPr>
+          <w:rFonts w:ascii="Garamond" w:eastAsia="Garamond" w:hAnsi="Garamond" w:cs="Garamond"/>
+          <w:sz w:val="14"/>
+          <w:szCs w:val="14"/>
+        </w:rPr>
+      </w:pPr>
+    </w:p>
+    <w:p>
+      <w:pPr>
+        <w:tabs>
+          <w:tab w:val="left" w:pos="1134"/>
+          <w:tab w:val="right" w:pos="10503"/>
+        </w:tabs>
+        <w:rPr>
+          <w:rFonts w:ascii="Garamond" w:eastAsia="Garamond" w:hAnsi="Garamond" w:cs="Garamond"/>
+          <w:sz w:val="22"/>
+          <w:szCs w:val="22"/>
+        </w:rPr>
+      </w:pPr>
+      <w:r>
+        <w:rPr>
+          <w:rFonts w:ascii="Garamond" w:eastAsia="Garamond" w:hAnsi="Garamond" w:cs="Garamond"/>
+          <w:b/>
+          <w:bCs/>
+          <w:sz w:val="21"/>
+          <w:szCs w:val="21"/>
+        </w:rPr>
+        <w:t>Gamified Learning System (Web App)</w:t>
+      </w:r>
+      <w:r>
+        <w:rPr>
+          <w:rFonts w:ascii="Garamond" w:eastAsia="Garamond" w:hAnsi="Garamond" w:cs="Garamond"/>
+          <w:sz w:val="21"/>
+          <w:szCs w:val="21"/>
+        </w:rPr>
+        <w:tab/>
+        <w:t>2025</w:t>
+      </w:r>
+    </w:p>
+    <w:p>
+      <w:pPr>
+        <w:numPr>
+          <w:ilvl w:val="0"/>
+          <w:numId w:val="1"/>
+        </w:numPr>
+        <w:tabs>
+          <w:tab w:val="left" w:pos="284"/>
+          <w:tab w:val="left" w:pos="630"/>
+          <w:tab w:val="left" w:pos="900"/>
+        </w:tabs>
+        <w:ind w:left="284" w:hanging="270"/>
+        <w:rPr>
+          <w:rFonts w:ascii="Garamond" w:eastAsia="Garamond" w:hAnsi="Garamond" w:cs="Garamond"/>
+          <w:sz w:val="21"/>
+          <w:szCs w:val="21"/>
+        </w:rPr>
+      </w:pPr>
+      <w:r>
+        <w:rPr>
+          <w:rFonts w:ascii="Garamond" w:eastAsia="Garamond" w:hAnsi="Garamond" w:cs="Garamond"/>
+          <w:sz w:val="21"/>
+          <w:szCs w:val="21"/>
+        </w:rPr>
+        <w:t>Developed a web-based gamified learning system to make educational activities more engaging for elementary students.</w:t>
+      </w:r>
+    </w:p>
+    <w:p>
+      <w:pPr>
+        <w:numPr>
+          <w:ilvl w:val="0"/>
+          <w:numId w:val="1"/>
+        </w:numPr>
+        <w:tabs>
+          <w:tab w:val="left" w:pos="284"/>
+          <w:tab w:val="left" w:pos="630"/>
+          <w:tab w:val="left" w:pos="900"/>
+        </w:tabs>
+        <w:ind w:left="284" w:hanging="270"/>
+        <w:rPr>
+          <w:rFonts w:ascii="Garamond" w:eastAsia="Garamond" w:hAnsi="Garamond" w:cs="Garamond"/>
+          <w:sz w:val="21"/>
+          <w:szCs w:val="21"/>
+        </w:rPr>
+      </w:pPr>
+      <w:r>
+        <w:rPr>
+          <w:rFonts w:ascii="Garamond" w:eastAsia="Garamond" w:hAnsi="Garamond" w:cs="Garamond"/>
+          <w:sz w:val="21"/>
+          <w:szCs w:val="21"/>
+        </w:rPr>
+        <w:t xml:space="preserve">Implemented </w:t>
+      </w:r>
+      <w:r>
+        <w:rPr>
+          <w:rFonts w:ascii="Garamond" w:eastAsia="Garamond" w:hAnsi="Garamond" w:cs="Garamond"/>
+          <w:sz w:val="21"/>
+          <w:szCs w:val="21"/>
+        </w:rPr>
+        <w:t>a LAN-based setup to allow the system to operate within the school without interrupting internet connection.</w:t>
+      </w:r>
+    </w:p>
+    <w:p>
+      <w:pPr>
+        <w:numPr>
+          <w:ilvl w:val="0"/>
+          <w:numId w:val="1"/>
+        </w:numPr>
+        <w:tabs>
+          <w:tab w:val="left" w:pos="284"/>
+          <w:tab w:val="left" w:pos="630"/>
+          <w:tab w:val="left" w:pos="900"/>
+        </w:tabs>
+        <w:ind w:left="284" w:hanging="270"/>
+        <w:rPr>
+          <w:rFonts w:ascii="Garamond" w:eastAsia="Garamond" w:hAnsi="Garamond" w:cs="Garamond"/>
+          <w:sz w:val="21"/>
+          <w:szCs w:val="21"/>
+        </w:rPr>
+      </w:pPr>
+      <w:r>
+        <w:rPr>
+          <w:rFonts w:ascii="Garamond" w:eastAsia="Garamond" w:hAnsi="Garamond" w:cs="Garamond"/>
+          <w:sz w:val="21"/>
+          <w:szCs w:val="21"/>
+        </w:rPr>
+        <w:t>Built using Laravel, Vue.js, Inertia.js, and MySQL with interactive learning activities and assessment features.</w:t>
+      </w:r>
+    </w:p>
+    <w:p>
+      <w:pPr>
+        <w:tabs>
+          <w:tab w:val="left" w:pos="284"/>
+          <w:tab w:val="left" w:pos="630"/>
+          <w:tab w:val="left" w:pos="900"/>
+        </w:tabs>
+        <w:ind w:left="14" w:hanging="720"/>
+        <w:rPr>
+          <w:rFonts w:ascii="Garamond" w:eastAsia="Garamond" w:hAnsi="Garamond" w:cs="Garamond"/>
+          <w:sz w:val="14"/>
+          <w:szCs w:val="14"/>
+        </w:rPr>
+      </w:pPr>
+    </w:p>
+    <w:p>
+      <w:pPr>
+        <w:tabs>
+          <w:tab w:val="left" w:pos="1134"/>
+          <w:tab w:val="right" w:pos="10503"/>
+        </w:tabs>
+        <w:rPr>
+          <w:rFonts w:ascii="Garamond" w:eastAsia="Garamond" w:hAnsi="Garamond" w:cs="Garamond"/>
+          <w:b/>
+          <w:bCs/>
+          <w:sz w:val="21"/>
+          <w:szCs w:val="21"/>
+          <w:lang w:val="en-PH"/>
+        </w:rPr>
+      </w:pPr>
+      <w:r>
+        <w:rPr>
+          <w:rFonts w:ascii="Garamond" w:eastAsia="Garamond" w:hAnsi="Garamond" w:cs="Garamond"/>
+          <w:b/>
+          <w:bCs/>
+          <w:sz w:val="21"/>
+          <w:szCs w:val="21"/>
+          <w:lang w:val="en-PH"/>
+        </w:rPr>
+        <w:t>Senior &amp; PWD Data Management System</w:t>
+      </w:r>
+      <w:r>
+        <w:rPr>
+          <w:rFonts w:ascii="Garamond" w:eastAsia="Garamond" w:hAnsi="Garamond" w:cs="Garamond"/>
+          <w:sz w:val="21"/>
+          <w:szCs w:val="21"/>
+        </w:rPr>
+        <w:tab/>
+        <w:t>202</w:t>
+      </w:r>
+      <w:r>
+        <w:rPr>
+          <w:rFonts w:ascii="Garamond" w:eastAsia="Garamond" w:hAnsi="Garamond" w:cs="Garamond"/>
+          <w:sz w:val="21"/>
+          <w:szCs w:val="21"/>
+        </w:rPr>
+        <w:t>6</w:t>
+      </w:r>
+    </w:p>
+    <w:p>
+      <w:pPr>
+        <w:numPr>
+          <w:ilvl w:val="0"/>
+          <w:numId w:val="1"/>
+        </w:numPr>
+        <w:tabs>
+          <w:tab w:val="left" w:pos="284"/>
+          <w:tab w:val="left" w:pos="630"/>
+          <w:tab w:val="left" w:pos="900"/>
+        </w:tabs>
+        <w:ind w:left="284" w:hanging="270"/>
+        <w:rPr>
+          <w:rFonts w:ascii="Garamond" w:eastAsia="Garamond" w:hAnsi="Garamond" w:cs="Garamond"/>
+          <w:sz w:val="21"/>
+          <w:szCs w:val="21"/>
+        </w:rPr>
+      </w:pPr>
+      <w:r>
+        <w:rPr>
+          <w:rFonts w:ascii="Garamond" w:eastAsia="Garamond" w:hAnsi="Garamond" w:cs="Garamond"/>
+          <w:sz w:val="21"/>
+          <w:szCs w:val="21"/>
+        </w:rPr>
+        <w:t>Developed a web application for managing Senior Citizen and PWD beneficiary records, ID applications, and releases.</w:t>
+      </w:r>
+    </w:p>
+    <w:p>
+      <w:pPr>
+        <w:numPr>
+          <w:ilvl w:val="0"/>
+          <w:numId w:val="1"/>
+        </w:numPr>
+        <w:tabs>
+          <w:tab w:val="left" w:pos="284"/>
+          <w:tab w:val="left" w:pos="630"/>
+          <w:tab w:val="left" w:pos="900"/>
+        </w:tabs>
+        <w:ind w:left="284" w:hanging="270"/>
+        <w:rPr>
+          <w:rFonts w:ascii="Garamond" w:eastAsia="Garamond" w:hAnsi="Garamond" w:cs="Garamond"/>
+          <w:sz w:val="21"/>
+          <w:szCs w:val="21"/>
+        </w:rPr>
+      </w:pPr>
+      <w:r>
+        <w:rPr>
+          <w:rFonts w:ascii="Garamond" w:eastAsia="Garamond" w:hAnsi="Garamond" w:cs="Garamond"/>
+          <w:sz w:val="21"/>
+          <w:szCs w:val="21"/>
+        </w:rPr>
+        <w:t>Developed as an OJT project to help organize and centralize beneficiary information for local government operations.</w:t>
+      </w:r>
+    </w:p>
+    <w:p>
+      <w:pPr>
+        <w:numPr>
+          <w:ilvl w:val="0"/>
+          <w:numId w:val="1"/>
+        </w:numPr>
+        <w:tabs>
+          <w:tab w:val="left" w:pos="284"/>
+          <w:tab w:val="left" w:pos="630"/>
+          <w:tab w:val="left" w:pos="900"/>
+        </w:tabs>
+        <w:ind w:left="284" w:hanging="270"/>
+        <w:rPr>
+          <w:rFonts w:ascii="Garamond" w:eastAsia="Garamond" w:hAnsi="Garamond" w:cs="Garamond"/>
+          <w:sz w:val="21"/>
+          <w:szCs w:val="21"/>
+        </w:rPr>
+      </w:pPr>
+      <w:r>
+        <w:rPr>
+          <w:rFonts w:ascii="Garamond" w:eastAsia="Garamond" w:hAnsi="Garamond" w:cs="Garamond"/>
+          <w:sz w:val="21"/>
+          <w:szCs w:val="21"/>
+        </w:rPr>
+        <w:t>Built using Laravel, MySQL, Blade, Tailwind CSS, and JavaScript with role-based access and reporting features.</w:t>
       </w:r>
     </w:p>
     <w:p>
@@ -726,175 +1151,7 @@
         </w:tabs>
         <w:rPr>
           <w:rFonts w:ascii="Garamond" w:eastAsia="Garamond" w:hAnsi="Garamond" w:cs="Garamond"/>
-          <w:sz w:val="21"/>
-          <w:szCs w:val="21"/>
-        </w:rPr>
-      </w:pPr>
-    </w:p>
-    <w:p>
-      <w:pPr>
-        <w:tabs>
-          <w:tab w:val="left" w:pos="1134"/>
-          <w:tab w:val="right" w:pos="10503"/>
-        </w:tabs>
-        <w:rPr>
-          <w:rFonts w:ascii="Garamond" w:eastAsia="Garamond" w:hAnsi="Garamond" w:cs="Garamond"/>
-          <w:sz w:val="21"/>
-          <w:szCs w:val="21"/>
-        </w:rPr>
-      </w:pPr>
-      <w:r>
-        <w:rPr>
-          <w:rFonts w:ascii="Garamond" w:eastAsia="Garamond" w:hAnsi="Garamond" w:cs="Garamond"/>
-          <w:b/>
-          <w:bCs/>
-          <w:color w:val="404040"/>
-          <w:sz w:val="21"/>
-          <w:szCs w:val="21"/>
-        </w:rPr>
-        <w:t>METRO DIGITAL INC.</w:t>
-      </w:r>
-      <w:r>
-        <w:rPr>
-          <w:rFonts w:ascii="Garamond" w:eastAsia="Garamond" w:hAnsi="Garamond" w:cs="Garamond"/>
-          <w:sz w:val="21"/>
-          <w:szCs w:val="21"/>
-        </w:rPr>
-        <w:tab/>
-        <w:t>Cebu City, Cebu</w:t>
-      </w:r>
-    </w:p>
-    <w:p>
-      <w:pPr>
-        <w:tabs>
-          <w:tab w:val="left" w:pos="1134"/>
-          <w:tab w:val="right" w:pos="10503"/>
-        </w:tabs>
-        <w:rPr>
-          <w:rFonts w:ascii="Garamond" w:eastAsia="Garamond" w:hAnsi="Garamond" w:cs="Garamond"/>
-          <w:sz w:val="22"/>
-          <w:szCs w:val="22"/>
-        </w:rPr>
-      </w:pPr>
-      <w:r>
-        <w:rPr>
-          <w:rFonts w:ascii="Garamond" w:eastAsia="Garamond" w:hAnsi="Garamond" w:cs="Garamond"/>
-          <w:sz w:val="21"/>
-          <w:szCs w:val="21"/>
-        </w:rPr>
-        <w:t>Web Developer</w:t>
-      </w:r>
-      <w:r>
-        <w:rPr>
-          <w:rFonts w:ascii="Garamond" w:eastAsia="Garamond" w:hAnsi="Garamond" w:cs="Garamond"/>
-          <w:sz w:val="21"/>
-          <w:szCs w:val="21"/>
-        </w:rPr>
-        <w:tab/>
-        <w:t>Jun 2022 – Dec 2023</w:t>
-      </w:r>
-    </w:p>
-    <w:p>
-      <w:pPr>
-        <w:numPr>
-          <w:ilvl w:val="0"/>
-          <w:numId w:val="1"/>
-        </w:numPr>
-        <w:tabs>
-          <w:tab w:val="left" w:pos="284"/>
-          <w:tab w:val="left" w:pos="630"/>
-          <w:tab w:val="left" w:pos="900"/>
-        </w:tabs>
-        <w:ind w:left="284" w:hanging="270"/>
-        <w:rPr>
-          <w:rFonts w:ascii="Garamond" w:eastAsia="Garamond" w:hAnsi="Garamond" w:cs="Garamond"/>
-          <w:sz w:val="21"/>
-          <w:szCs w:val="21"/>
-        </w:rPr>
-      </w:pPr>
-      <w:r>
-        <w:rPr>
-          <w:rFonts w:ascii="Garamond" w:eastAsia="Garamond" w:hAnsi="Garamond" w:cs="Garamond"/>
-          <w:sz w:val="21"/>
-          <w:szCs w:val="21"/>
-        </w:rPr>
-        <w:t>Migrated a legacy PHP system to Laravel, reducing server costs by 30% and improving maintainability</w:t>
-      </w:r>
-    </w:p>
-    <w:p>
-      <w:pPr>
-        <w:numPr>
-          <w:ilvl w:val="0"/>
-          <w:numId w:val="1"/>
-        </w:numPr>
-        <w:tabs>
-          <w:tab w:val="left" w:pos="284"/>
-          <w:tab w:val="left" w:pos="630"/>
-          <w:tab w:val="left" w:pos="900"/>
-        </w:tabs>
-        <w:ind w:left="284" w:hanging="270"/>
-        <w:rPr>
-          <w:rFonts w:ascii="Garamond" w:eastAsia="Garamond" w:hAnsi="Garamond" w:cs="Garamond"/>
-          <w:sz w:val="21"/>
-          <w:szCs w:val="21"/>
-        </w:rPr>
-      </w:pPr>
-      <w:r>
-        <w:rPr>
-          <w:rFonts w:ascii="Garamond" w:eastAsia="Garamond" w:hAnsi="Garamond" w:cs="Garamond"/>
-          <w:sz w:val="21"/>
-          <w:szCs w:val="21"/>
-        </w:rPr>
-        <w:t xml:space="preserve">Automated manual reporting with Python scripts, saving the team 10+ hours weekly; integrated </w:t>
-      </w:r>
-      <w:proofErr w:type="spellStart"/>
-      <w:r>
-        <w:rPr>
-          <w:rFonts w:ascii="Garamond" w:eastAsia="Garamond" w:hAnsi="Garamond" w:cs="Garamond"/>
-          <w:sz w:val="21"/>
-          <w:szCs w:val="21"/>
-        </w:rPr>
-        <w:t>GCash</w:t>
-      </w:r>
-      <w:proofErr w:type="spellEnd"/>
-      <w:r>
-        <w:rPr>
-          <w:rFonts w:ascii="Garamond" w:eastAsia="Garamond" w:hAnsi="Garamond" w:cs="Garamond"/>
-          <w:sz w:val="21"/>
-          <w:szCs w:val="21"/>
-        </w:rPr>
-        <w:t xml:space="preserve"> and </w:t>
-      </w:r>
-      <w:proofErr w:type="spellStart"/>
-      <w:r>
-        <w:rPr>
-          <w:rFonts w:ascii="Garamond" w:eastAsia="Garamond" w:hAnsi="Garamond" w:cs="Garamond"/>
-          <w:sz w:val="21"/>
-          <w:szCs w:val="21"/>
-        </w:rPr>
-        <w:t>PayMaya</w:t>
-      </w:r>
-      <w:proofErr w:type="spellEnd"/>
-      <w:r>
-        <w:rPr>
-          <w:rFonts w:ascii="Garamond" w:eastAsia="Garamond" w:hAnsi="Garamond" w:cs="Garamond"/>
-          <w:sz w:val="21"/>
-          <w:szCs w:val="21"/>
-        </w:rPr>
-        <w:t xml:space="preserve"> payment gateways</w:t>
-      </w:r>
-    </w:p>
-    <w:p>
-      <w:pPr>
-        <w:pBdr>
-          <w:bottom w:val="single" w:sz="6" w:space="1" w:color="000000"/>
-        </w:pBdr>
-        <w:tabs>
-          <w:tab w:val="left" w:pos="900"/>
-        </w:tabs>
-        <w:rPr>
-          <w:rFonts w:ascii="Garamond" w:eastAsia="Garamond" w:hAnsi="Garamond" w:cs="Garamond"/>
-          <w:color w:val="404040"/>
+          <w:color w:val="000000"/>
           <w:sz w:val="21"/>
           <w:szCs w:val="21"/>
         </w:rPr>
@@ -923,7 +1180,7 @@
           <w:sz w:val="22"/>
           <w:szCs w:val="22"/>
         </w:rPr>
-        <w:t>PROJECTS</w:t>
+        <w:t>ADDITIONAL</w:t>
       </w:r>
       <w:r>
         <w:rPr>
@@ -937,11 +1194,11 @@
     <w:p>
       <w:pPr>
         <w:tabs>
-          <w:tab w:val="left" w:pos="900"/>
-        </w:tabs>
-        <w:rPr>
-          <w:rFonts w:ascii="Garamond" w:eastAsia="Garamond" w:hAnsi="Garamond" w:cs="Garamond"/>
-          <w:color w:val="404040"/>
+          <w:tab w:val="left" w:pos="630"/>
+          <w:tab w:val="left" w:pos="900"/>
+        </w:tabs>
+        <w:rPr>
+          <w:rFonts w:ascii="Garamond" w:eastAsia="Garamond" w:hAnsi="Garamond" w:cs="Garamond"/>
           <w:sz w:val="4"/>
           <w:szCs w:val="4"/>
         </w:rPr>
@@ -950,11 +1207,11 @@
     <w:p>
       <w:pPr>
         <w:tabs>
-          <w:tab w:val="left" w:pos="900"/>
-        </w:tabs>
-        <w:rPr>
-          <w:rFonts w:ascii="Garamond" w:eastAsia="Garamond" w:hAnsi="Garamond" w:cs="Garamond"/>
-          <w:color w:val="404040"/>
+          <w:tab w:val="left" w:pos="630"/>
+          <w:tab w:val="left" w:pos="900"/>
+        </w:tabs>
+        <w:rPr>
+          <w:rFonts w:ascii="Garamond" w:eastAsia="Garamond" w:hAnsi="Garamond" w:cs="Garamond"/>
           <w:sz w:val="6"/>
           <w:szCs w:val="6"/>
         </w:rPr>
@@ -963,13 +1220,13 @@
     <w:p>
       <w:pPr>
         <w:tabs>
-          <w:tab w:val="left" w:pos="1134"/>
-          <w:tab w:val="right" w:pos="10503"/>
-        </w:tabs>
-        <w:rPr>
-          <w:rFonts w:ascii="Garamond" w:eastAsia="Garamond" w:hAnsi="Garamond" w:cs="Garamond"/>
-          <w:sz w:val="22"/>
-          <w:szCs w:val="22"/>
+          <w:tab w:val="left" w:pos="630"/>
+          <w:tab w:val="left" w:pos="900"/>
+        </w:tabs>
+        <w:rPr>
+          <w:rFonts w:ascii="Garamond" w:eastAsia="Garamond" w:hAnsi="Garamond" w:cs="Garamond"/>
+          <w:sz w:val="21"/>
+          <w:szCs w:val="21"/>
         </w:rPr>
       </w:pPr>
       <w:r>
@@ -980,9 +1237,63 @@
           <w:sz w:val="21"/>
           <w:szCs w:val="21"/>
         </w:rPr>
-        <w:t>Gamified Learning System</w:t>
-      </w:r>
-      <w:r>
+        <w:t>Technical Skills</w:t>
+      </w:r>
+      <w:r>
+        <w:rPr>
+          <w:rFonts w:ascii="Garamond" w:eastAsia="Garamond" w:hAnsi="Garamond" w:cs="Garamond"/>
+          <w:sz w:val="21"/>
+          <w:szCs w:val="21"/>
+        </w:rPr>
+        <w:t>: Proficient in JavaScript, PHP (Laravel), React,</w:t>
+      </w:r>
+      <w:r>
+        <w:rPr>
+          <w:rFonts w:ascii="Garamond" w:eastAsia="Garamond" w:hAnsi="Garamond" w:cs="Garamond"/>
+          <w:sz w:val="21"/>
+          <w:szCs w:val="21"/>
+        </w:rPr>
+        <w:t xml:space="preserve"> </w:t>
+      </w:r>
+      <w:r>
+        <w:rPr>
+          <w:rFonts w:ascii="Garamond" w:eastAsia="Garamond" w:hAnsi="Garamond" w:cs="Garamond"/>
+          <w:sz w:val="21"/>
+          <w:szCs w:val="21"/>
+        </w:rPr>
+        <w:t>MySQL, HTML/CSS; Familiar with Python, Git, Docker</w:t>
+      </w:r>
+      <w:r>
+        <w:rPr>
+          <w:rFonts w:ascii="Garamond" w:eastAsia="Garamond" w:hAnsi="Garamond" w:cs="Garamond"/>
+          <w:sz w:val="21"/>
+          <w:szCs w:val="21"/>
+        </w:rPr>
+        <w:t xml:space="preserve"> and</w:t>
+      </w:r>
+      <w:r>
+        <w:rPr>
+          <w:rFonts w:ascii="Garamond" w:eastAsia="Garamond" w:hAnsi="Garamond" w:cs="Garamond"/>
+          <w:sz w:val="21"/>
+          <w:szCs w:val="21"/>
+        </w:rPr>
+        <w:t xml:space="preserve"> REST APIs</w:t>
+      </w:r>
+      <w:r>
+        <w:rPr>
+          <w:rFonts w:ascii="Garamond" w:eastAsia="Garamond" w:hAnsi="Garamond" w:cs="Garamond"/>
+          <w:sz w:val="21"/>
+          <w:szCs w:val="21"/>
+        </w:rPr>
+        <w:t>.</w:t>
+      </w:r>
+    </w:p>
+    <w:p>
+      <w:pPr>
+        <w:tabs>
+          <w:tab w:val="left" w:pos="630"/>
+          <w:tab w:val="left" w:pos="900"/>
+        </w:tabs>
         <w:rPr>
           <w:rFonts w:ascii="Garamond" w:eastAsia="Garamond" w:hAnsi="Garamond" w:cs="Garamond"/>
           <w:b/>
@@ -990,8 +1301,7 @@
           <w:sz w:val="21"/>
           <w:szCs w:val="21"/>
         </w:rPr>
-        <w:t xml:space="preserve"> </w:t>
-      </w:r>
+      </w:pPr>
       <w:r>
         <w:rPr>
           <w:rFonts w:ascii="Garamond" w:eastAsia="Garamond" w:hAnsi="Garamond" w:cs="Garamond"/>
@@ -1000,806 +1310,6 @@
           <w:sz w:val="21"/>
           <w:szCs w:val="21"/>
         </w:rPr>
-        <w:t>(Web</w:t>
-      </w:r>
-      <w:r>
-        <w:rPr>
-          <w:rFonts w:ascii="Garamond" w:eastAsia="Garamond" w:hAnsi="Garamond" w:cs="Garamond"/>
-          <w:b/>
-          <w:bCs/>
-          <w:sz w:val="21"/>
-          <w:szCs w:val="21"/>
-        </w:rPr>
-        <w:t xml:space="preserve"> App)</w:t>
-      </w:r>
-      <w:r>
-        <w:rPr>
-          <w:rFonts w:ascii="Garamond" w:eastAsia="Garamond" w:hAnsi="Garamond" w:cs="Garamond"/>
-          <w:sz w:val="21"/>
-          <w:szCs w:val="21"/>
-        </w:rPr>
-        <w:tab/>
-        <w:t>202</w:t>
-      </w:r>
-      <w:r>
-        <w:rPr>
-          <w:rFonts w:ascii="Garamond" w:eastAsia="Garamond" w:hAnsi="Garamond" w:cs="Garamond"/>
-          <w:sz w:val="21"/>
-          <w:szCs w:val="21"/>
-        </w:rPr>
-        <w:t>5</w:t>
-      </w:r>
-    </w:p>
-    <w:p>
-      <w:pPr>
-        <w:numPr>
-          <w:ilvl w:val="0"/>
-          <w:numId w:val="1"/>
-        </w:numPr>
-        <w:tabs>
-          <w:tab w:val="left" w:pos="284"/>
-          <w:tab w:val="left" w:pos="630"/>
-          <w:tab w:val="left" w:pos="900"/>
-        </w:tabs>
-        <w:ind w:left="284" w:hanging="270"/>
-        <w:rPr>
-          <w:rFonts w:ascii="Garamond" w:eastAsia="Garamond" w:hAnsi="Garamond" w:cs="Garamond"/>
-          <w:sz w:val="21"/>
-          <w:szCs w:val="21"/>
-        </w:rPr>
-      </w:pPr>
-      <w:r>
-        <w:rPr>
-          <w:rFonts w:ascii="Garamond" w:eastAsia="Garamond" w:hAnsi="Garamond" w:cs="Garamond"/>
-          <w:sz w:val="21"/>
-          <w:szCs w:val="21"/>
-        </w:rPr>
-        <w:t xml:space="preserve">Built a </w:t>
-      </w:r>
-      <w:r>
-        <w:rPr>
-          <w:rFonts w:ascii="Garamond" w:eastAsia="Garamond" w:hAnsi="Garamond" w:cs="Garamond"/>
-          <w:sz w:val="21"/>
-          <w:szCs w:val="21"/>
-        </w:rPr>
-        <w:t>Laravel with Vue.js</w:t>
-      </w:r>
-      <w:r>
-        <w:rPr>
-          <w:rFonts w:ascii="Garamond" w:eastAsia="Garamond" w:hAnsi="Garamond" w:cs="Garamond"/>
-          <w:sz w:val="21"/>
-          <w:szCs w:val="21"/>
-        </w:rPr>
-        <w:t xml:space="preserve"> app that </w:t>
-      </w:r>
-      <w:r>
-        <w:rPr>
-          <w:rFonts w:ascii="Garamond" w:eastAsia="Garamond" w:hAnsi="Garamond" w:cs="Garamond"/>
-          <w:sz w:val="21"/>
-          <w:szCs w:val="21"/>
-        </w:rPr>
-        <w:t>designed to make learning more engaging through gamified educational activities.</w:t>
-      </w:r>
-    </w:p>
-    <w:p>
-      <w:pPr>
-        <w:numPr>
-          <w:ilvl w:val="0"/>
-          <w:numId w:val="1"/>
-        </w:numPr>
-        <w:tabs>
-          <w:tab w:val="left" w:pos="284"/>
-          <w:tab w:val="left" w:pos="630"/>
-          <w:tab w:val="left" w:pos="900"/>
-        </w:tabs>
-        <w:ind w:left="284" w:hanging="270"/>
-        <w:rPr>
-          <w:rFonts w:ascii="Garamond" w:eastAsia="Garamond" w:hAnsi="Garamond" w:cs="Garamond"/>
-          <w:sz w:val="21"/>
-          <w:szCs w:val="21"/>
-        </w:rPr>
-      </w:pPr>
-      <w:r>
-        <w:rPr>
-          <w:rFonts w:ascii="Garamond" w:eastAsia="Garamond" w:hAnsi="Garamond" w:cs="Garamond"/>
-          <w:sz w:val="21"/>
-          <w:szCs w:val="21"/>
-        </w:rPr>
-        <w:t xml:space="preserve">Implemented offline </w:t>
-      </w:r>
-      <w:r>
-        <w:rPr>
-          <w:rFonts w:ascii="Garamond" w:eastAsia="Garamond" w:hAnsi="Garamond" w:cs="Garamond"/>
-          <w:sz w:val="21"/>
-          <w:szCs w:val="21"/>
-        </w:rPr>
-        <w:t>so it can be low cost and just accessible within the school through LAN.</w:t>
-      </w:r>
-    </w:p>
-    <w:p>
-      <w:pPr>
-        <w:tabs>
-          <w:tab w:val="left" w:pos="284"/>
-          <w:tab w:val="left" w:pos="630"/>
-          <w:tab w:val="left" w:pos="900"/>
-        </w:tabs>
-        <w:ind w:left="14" w:hanging="720"/>
-        <w:rPr>
-          <w:rFonts w:ascii="Garamond" w:eastAsia="Garamond" w:hAnsi="Garamond" w:cs="Garamond"/>
-          <w:sz w:val="14"/>
-          <w:szCs w:val="14"/>
-        </w:rPr>
-      </w:pPr>
-    </w:p>
-    <w:p>
-      <w:pPr>
-        <w:tabs>
-          <w:tab w:val="left" w:pos="1134"/>
-          <w:tab w:val="right" w:pos="10503"/>
-        </w:tabs>
-        <w:rPr>
-          <w:rFonts w:ascii="Garamond" w:eastAsia="Garamond" w:hAnsi="Garamond" w:cs="Garamond"/>
-          <w:b/>
-          <w:bCs/>
-          <w:sz w:val="21"/>
-          <w:szCs w:val="21"/>
-          <w:lang w:val="en-PH"/>
-        </w:rPr>
-      </w:pPr>
-      <w:r>
-        <w:rPr>
-          <w:rFonts w:ascii="Garamond" w:eastAsia="Garamond" w:hAnsi="Garamond" w:cs="Garamond"/>
-          <w:b/>
-          <w:bCs/>
-          <w:sz w:val="21"/>
-          <w:szCs w:val="21"/>
-          <w:lang w:val="en-PH"/>
-        </w:rPr>
-        <w:t>Senior &amp; PWD Data Management System</w:t>
-      </w:r>
-      <w:r>
-        <w:rPr>
-          <w:rFonts w:ascii="Garamond" w:eastAsia="Garamond" w:hAnsi="Garamond" w:cs="Garamond"/>
-          <w:sz w:val="21"/>
-          <w:szCs w:val="21"/>
-        </w:rPr>
-        <w:tab/>
-        <w:t>202</w:t>
-      </w:r>
-      <w:r>
-        <w:rPr>
-          <w:rFonts w:ascii="Garamond" w:eastAsia="Garamond" w:hAnsi="Garamond" w:cs="Garamond"/>
-          <w:sz w:val="21"/>
-          <w:szCs w:val="21"/>
-        </w:rPr>
-        <w:t>6</w:t>
-      </w:r>
-    </w:p>
-    <w:p>
-      <w:pPr>
-        <w:numPr>
-          <w:ilvl w:val="0"/>
-          <w:numId w:val="1"/>
-        </w:numPr>
-        <w:tabs>
-          <w:tab w:val="left" w:pos="284"/>
-          <w:tab w:val="left" w:pos="630"/>
-          <w:tab w:val="left" w:pos="900"/>
-        </w:tabs>
-        <w:ind w:left="284" w:hanging="270"/>
-        <w:rPr>
-          <w:rFonts w:ascii="Garamond" w:eastAsia="Garamond" w:hAnsi="Garamond" w:cs="Garamond"/>
-          <w:sz w:val="21"/>
-          <w:szCs w:val="21"/>
-        </w:rPr>
-      </w:pPr>
-      <w:r>
-        <w:rPr>
-          <w:rFonts w:ascii="Garamond" w:eastAsia="Garamond" w:hAnsi="Garamond" w:cs="Garamond"/>
-          <w:sz w:val="21"/>
-          <w:szCs w:val="21"/>
-        </w:rPr>
-        <w:t>Developed a web</w:t>
-      </w:r>
-      <w:r>
-        <w:rPr>
-          <w:rFonts w:ascii="Garamond" w:eastAsia="Garamond" w:hAnsi="Garamond" w:cs="Garamond"/>
-          <w:sz w:val="21"/>
-          <w:szCs w:val="21"/>
-        </w:rPr>
-        <w:t xml:space="preserve"> application for organizing beneficiary records and managing ID releases</w:t>
-      </w:r>
-      <w:r>
-        <w:rPr>
-          <w:rFonts w:ascii="Garamond" w:eastAsia="Garamond" w:hAnsi="Garamond" w:cs="Garamond"/>
-          <w:sz w:val="21"/>
-          <w:szCs w:val="21"/>
-        </w:rPr>
-        <w:t xml:space="preserve"> using Laravel and MySQL</w:t>
-      </w:r>
-    </w:p>
-    <w:p>
-      <w:pPr>
-        <w:numPr>
-          <w:ilvl w:val="0"/>
-          <w:numId w:val="1"/>
-        </w:numPr>
-        <w:tabs>
-          <w:tab w:val="left" w:pos="284"/>
-          <w:tab w:val="left" w:pos="630"/>
-          <w:tab w:val="left" w:pos="900"/>
-        </w:tabs>
-        <w:ind w:left="284" w:hanging="270"/>
-        <w:rPr>
-          <w:rFonts w:ascii="Garamond" w:eastAsia="Garamond" w:hAnsi="Garamond" w:cs="Garamond"/>
-          <w:sz w:val="21"/>
-          <w:szCs w:val="21"/>
-        </w:rPr>
-      </w:pPr>
-      <w:r>
-        <w:rPr>
-          <w:rFonts w:ascii="Garamond" w:eastAsia="Garamond" w:hAnsi="Garamond" w:cs="Garamond"/>
-          <w:sz w:val="21"/>
-          <w:szCs w:val="21"/>
-        </w:rPr>
-        <w:t>OJT</w:t>
-      </w:r>
-      <w:r>
-        <w:rPr>
-          <w:rFonts w:ascii="Garamond" w:eastAsia="Garamond" w:hAnsi="Garamond" w:cs="Garamond"/>
-          <w:sz w:val="21"/>
-          <w:szCs w:val="21"/>
-        </w:rPr>
-        <w:t xml:space="preserve"> Project</w:t>
-      </w:r>
-    </w:p>
-    <w:p>
-      <w:pPr>
-        <w:pBdr>
-          <w:bottom w:val="single" w:sz="6" w:space="1" w:color="000000"/>
-        </w:pBdr>
-        <w:tabs>
-          <w:tab w:val="left" w:pos="900"/>
-        </w:tabs>
-        <w:rPr>
-          <w:rFonts w:ascii="Garamond" w:eastAsia="Garamond" w:hAnsi="Garamond" w:cs="Garamond"/>
-          <w:color w:val="404040"/>
-          <w:sz w:val="21"/>
-          <w:szCs w:val="21"/>
-        </w:rPr>
-      </w:pPr>
-    </w:p>
-    <w:p>
-      <w:pPr>
-        <w:pBdr>
-          <w:bottom w:val="single" w:sz="6" w:space="1" w:color="000000"/>
-        </w:pBdr>
-        <w:tabs>
-          <w:tab w:val="left" w:pos="900"/>
-        </w:tabs>
-        <w:rPr>
-          <w:rFonts w:ascii="Garamond" w:eastAsia="Garamond" w:hAnsi="Garamond" w:cs="Garamond"/>
-          <w:sz w:val="21"/>
-          <w:szCs w:val="21"/>
-        </w:rPr>
-      </w:pPr>
-      <w:r>
-        <w:rPr>
-          <w:rFonts w:ascii="Garamond" w:eastAsia="Garamond" w:hAnsi="Garamond" w:cs="Garamond"/>
-          <w:b/>
-          <w:bCs/>
-          <w:color w:val="404040"/>
-          <w:sz w:val="22"/>
-          <w:szCs w:val="22"/>
-        </w:rPr>
-        <w:t>ACTIVITIES</w:t>
-      </w:r>
-      <w:r>
-        <w:rPr>
-          <w:rFonts w:ascii="Garamond" w:eastAsia="Garamond" w:hAnsi="Garamond" w:cs="Garamond"/>
-          <w:sz w:val="21"/>
-          <w:szCs w:val="21"/>
-        </w:rPr>
-        <w:tab/>
-      </w:r>
-    </w:p>
-    <w:p>
-      <w:pPr>
-        <w:tabs>
-          <w:tab w:val="left" w:pos="900"/>
-        </w:tabs>
-        <w:rPr>
-          <w:rFonts w:ascii="Garamond" w:eastAsia="Garamond" w:hAnsi="Garamond" w:cs="Garamond"/>
-          <w:color w:val="404040"/>
-          <w:sz w:val="4"/>
-          <w:szCs w:val="4"/>
-        </w:rPr>
-      </w:pPr>
-    </w:p>
-    <w:p>
-      <w:pPr>
-        <w:tabs>
-          <w:tab w:val="left" w:pos="900"/>
-        </w:tabs>
-        <w:rPr>
-          <w:rFonts w:ascii="Garamond" w:eastAsia="Garamond" w:hAnsi="Garamond" w:cs="Garamond"/>
-          <w:color w:val="404040"/>
-          <w:sz w:val="6"/>
-          <w:szCs w:val="6"/>
-        </w:rPr>
-      </w:pPr>
-    </w:p>
-    <w:p>
-      <w:pPr>
-        <w:tabs>
-          <w:tab w:val="left" w:pos="1134"/>
-          <w:tab w:val="right" w:pos="10503"/>
-        </w:tabs>
-        <w:rPr>
-          <w:rFonts w:ascii="Garamond" w:eastAsia="Garamond" w:hAnsi="Garamond" w:cs="Garamond"/>
-          <w:sz w:val="22"/>
-          <w:szCs w:val="22"/>
-        </w:rPr>
-      </w:pPr>
-      <w:r>
-        <w:rPr>
-          <w:rFonts w:ascii="Garamond" w:eastAsia="Garamond" w:hAnsi="Garamond" w:cs="Garamond"/>
-          <w:b/>
-          <w:bCs/>
-          <w:color w:val="404040"/>
-          <w:sz w:val="21"/>
-          <w:szCs w:val="21"/>
-        </w:rPr>
-        <w:t>GOOGLE DEVELOPER STUDENT CLUB (GDSC)</w:t>
-      </w:r>
-      <w:r>
-        <w:rPr>
-          <w:rFonts w:ascii="Garamond" w:eastAsia="Garamond" w:hAnsi="Garamond" w:cs="Garamond"/>
-          <w:sz w:val="21"/>
-          <w:szCs w:val="21"/>
-        </w:rPr>
-        <w:tab/>
-        <w:t>Quezon City</w:t>
-      </w:r>
-    </w:p>
-    <w:p>
-      <w:pPr>
-        <w:tabs>
-          <w:tab w:val="left" w:pos="1134"/>
-          <w:tab w:val="right" w:pos="10503"/>
-        </w:tabs>
-        <w:rPr>
-          <w:rFonts w:ascii="Garamond" w:eastAsia="Garamond" w:hAnsi="Garamond" w:cs="Garamond"/>
-          <w:sz w:val="22"/>
-          <w:szCs w:val="22"/>
-        </w:rPr>
-      </w:pPr>
-      <w:r>
-        <w:rPr>
-          <w:rFonts w:ascii="Garamond" w:eastAsia="Garamond" w:hAnsi="Garamond" w:cs="Garamond"/>
-          <w:sz w:val="21"/>
-          <w:szCs w:val="21"/>
-        </w:rPr>
-        <w:t xml:space="preserve">Tech </w:t>
-      </w:r>
-      <w:proofErr w:type="gramStart"/>
-      <w:r>
-        <w:rPr>
-          <w:rFonts w:ascii="Garamond" w:eastAsia="Garamond" w:hAnsi="Garamond" w:cs="Garamond"/>
-          <w:sz w:val="21"/>
-          <w:szCs w:val="21"/>
-        </w:rPr>
-        <w:t>Lead</w:t>
-      </w:r>
-      <w:proofErr w:type="gramEnd"/>
-      <w:r>
-        <w:rPr>
-          <w:rFonts w:ascii="Garamond" w:eastAsia="Garamond" w:hAnsi="Garamond" w:cs="Garamond"/>
-          <w:sz w:val="21"/>
-          <w:szCs w:val="21"/>
-        </w:rPr>
-        <w:tab/>
-        <w:t>Aug 2022 – May 2024</w:t>
-      </w:r>
-    </w:p>
-    <w:p>
-      <w:pPr>
-        <w:numPr>
-          <w:ilvl w:val="0"/>
-          <w:numId w:val="1"/>
-        </w:numPr>
-        <w:pBdr>
-          <w:top w:val="nil"/>
-          <w:left w:val="nil"/>
-          <w:bottom w:val="nil"/>
-          <w:right w:val="nil"/>
-          <w:between w:val="nil"/>
-        </w:pBdr>
-        <w:tabs>
-          <w:tab w:val="left" w:pos="284"/>
-          <w:tab w:val="left" w:pos="630"/>
-          <w:tab w:val="left" w:pos="900"/>
-        </w:tabs>
-        <w:ind w:left="284" w:hanging="270"/>
-        <w:rPr>
-          <w:rFonts w:ascii="Garamond" w:eastAsia="Garamond" w:hAnsi="Garamond" w:cs="Garamond"/>
-          <w:color w:val="000000"/>
-          <w:sz w:val="21"/>
-          <w:szCs w:val="21"/>
-        </w:rPr>
-      </w:pPr>
-      <w:r>
-        <w:rPr>
-          <w:rFonts w:ascii="Garamond" w:eastAsia="Garamond" w:hAnsi="Garamond" w:cs="Garamond"/>
-          <w:color w:val="000000"/>
-          <w:sz w:val="21"/>
-          <w:szCs w:val="21"/>
-        </w:rPr>
-        <w:t>Organized 10+ hands-on coding workshops and a 3-day hackathon for 300+ students</w:t>
-      </w:r>
-    </w:p>
-    <w:p>
-      <w:pPr>
-        <w:numPr>
-          <w:ilvl w:val="0"/>
-          <w:numId w:val="1"/>
-        </w:numPr>
-        <w:pBdr>
-          <w:top w:val="nil"/>
-          <w:left w:val="nil"/>
-          <w:bottom w:val="nil"/>
-          <w:right w:val="nil"/>
-          <w:between w:val="nil"/>
-        </w:pBdr>
-        <w:tabs>
-          <w:tab w:val="left" w:pos="284"/>
-          <w:tab w:val="left" w:pos="630"/>
-          <w:tab w:val="left" w:pos="900"/>
-        </w:tabs>
-        <w:ind w:left="284" w:hanging="270"/>
-        <w:rPr>
-          <w:rFonts w:ascii="Garamond" w:eastAsia="Garamond" w:hAnsi="Garamond" w:cs="Garamond"/>
-          <w:color w:val="000000"/>
-          <w:sz w:val="21"/>
-          <w:szCs w:val="21"/>
-        </w:rPr>
-      </w:pPr>
-      <w:r>
-        <w:rPr>
-          <w:rFonts w:ascii="Garamond" w:eastAsia="Garamond" w:hAnsi="Garamond" w:cs="Garamond"/>
-          <w:color w:val="000000"/>
-          <w:sz w:val="21"/>
-          <w:szCs w:val="21"/>
-        </w:rPr>
-        <w:t>Mentored 20+ junior members in Git, web development, and technical interview preparation</w:t>
-      </w:r>
-    </w:p>
-    <w:p>
-      <w:pPr>
-        <w:pBdr>
-          <w:top w:val="nil"/>
-          <w:left w:val="nil"/>
-          <w:bottom w:val="nil"/>
-          <w:right w:val="nil"/>
-          <w:between w:val="nil"/>
-        </w:pBdr>
-        <w:tabs>
-          <w:tab w:val="left" w:pos="284"/>
-          <w:tab w:val="left" w:pos="630"/>
-          <w:tab w:val="left" w:pos="900"/>
-        </w:tabs>
-        <w:ind w:left="14" w:hanging="720"/>
-        <w:rPr>
-          <w:rFonts w:ascii="Garamond" w:eastAsia="Garamond" w:hAnsi="Garamond" w:cs="Garamond"/>
-          <w:color w:val="000000"/>
-          <w:sz w:val="14"/>
-          <w:szCs w:val="14"/>
-        </w:rPr>
-      </w:pPr>
-    </w:p>
-    <w:p>
-      <w:pPr>
-        <w:tabs>
-          <w:tab w:val="left" w:pos="1134"/>
-          <w:tab w:val="right" w:pos="10503"/>
-        </w:tabs>
-        <w:rPr>
-          <w:rFonts w:ascii="Garamond" w:eastAsia="Garamond" w:hAnsi="Garamond" w:cs="Garamond"/>
-          <w:sz w:val="22"/>
-          <w:szCs w:val="22"/>
-        </w:rPr>
-      </w:pPr>
-      <w:r>
-        <w:rPr>
-          <w:rFonts w:ascii="Garamond" w:eastAsia="Garamond" w:hAnsi="Garamond" w:cs="Garamond"/>
-          <w:b/>
-          <w:bCs/>
-          <w:color w:val="404040"/>
-          <w:sz w:val="21"/>
-          <w:szCs w:val="21"/>
-        </w:rPr>
-        <w:t>COMPETITIVE PROGRAMMING CLUB</w:t>
-      </w:r>
-      <w:r>
-        <w:rPr>
-          <w:rFonts w:ascii="Garamond" w:eastAsia="Garamond" w:hAnsi="Garamond" w:cs="Garamond"/>
-          <w:sz w:val="21"/>
-          <w:szCs w:val="21"/>
-        </w:rPr>
-        <w:tab/>
-        <w:t>Quezon City</w:t>
-      </w:r>
-    </w:p>
-    <w:p>
-      <w:pPr>
-        <w:tabs>
-          <w:tab w:val="left" w:pos="1134"/>
-          <w:tab w:val="right" w:pos="10503"/>
-        </w:tabs>
-        <w:rPr>
-          <w:rFonts w:ascii="Garamond" w:eastAsia="Garamond" w:hAnsi="Garamond" w:cs="Garamond"/>
-          <w:color w:val="000000"/>
-          <w:sz w:val="21"/>
-          <w:szCs w:val="21"/>
-        </w:rPr>
-      </w:pPr>
-      <w:r>
-        <w:rPr>
-          <w:rFonts w:ascii="Garamond" w:eastAsia="Garamond" w:hAnsi="Garamond" w:cs="Garamond"/>
-          <w:sz w:val="21"/>
-          <w:szCs w:val="21"/>
-        </w:rPr>
-        <w:t>Member</w:t>
-      </w:r>
-      <w:r>
-        <w:rPr>
-          <w:rFonts w:ascii="Garamond" w:eastAsia="Garamond" w:hAnsi="Garamond" w:cs="Garamond"/>
-          <w:sz w:val="21"/>
-          <w:szCs w:val="21"/>
-        </w:rPr>
-        <w:tab/>
-        <w:t>Jun 2021 – May 2024</w:t>
-      </w:r>
-    </w:p>
-    <w:p>
-      <w:pPr>
-        <w:numPr>
-          <w:ilvl w:val="0"/>
-          <w:numId w:val="1"/>
-        </w:numPr>
-        <w:pBdr>
-          <w:top w:val="nil"/>
-          <w:left w:val="nil"/>
-          <w:bottom w:val="nil"/>
-          <w:right w:val="nil"/>
-          <w:between w:val="nil"/>
-        </w:pBdr>
-        <w:tabs>
-          <w:tab w:val="left" w:pos="284"/>
-          <w:tab w:val="left" w:pos="630"/>
-          <w:tab w:val="left" w:pos="900"/>
-        </w:tabs>
-        <w:ind w:left="284" w:hanging="270"/>
-        <w:rPr>
-          <w:rFonts w:ascii="Garamond" w:eastAsia="Garamond" w:hAnsi="Garamond" w:cs="Garamond"/>
-          <w:color w:val="000000"/>
-          <w:sz w:val="21"/>
-          <w:szCs w:val="21"/>
-        </w:rPr>
-      </w:pPr>
-      <w:r>
-        <w:rPr>
-          <w:rFonts w:ascii="Garamond" w:eastAsia="Garamond" w:hAnsi="Garamond" w:cs="Garamond"/>
-          <w:sz w:val="21"/>
-          <w:szCs w:val="21"/>
-        </w:rPr>
-        <w:t xml:space="preserve">Competed in </w:t>
-      </w:r>
-      <w:proofErr w:type="spellStart"/>
-      <w:r>
-        <w:rPr>
-          <w:rFonts w:ascii="Garamond" w:eastAsia="Garamond" w:hAnsi="Garamond" w:cs="Garamond"/>
-          <w:sz w:val="21"/>
-          <w:szCs w:val="21"/>
-        </w:rPr>
-        <w:t>HackerRank</w:t>
-      </w:r>
-      <w:proofErr w:type="spellEnd"/>
-      <w:r>
-        <w:rPr>
-          <w:rFonts w:ascii="Garamond" w:eastAsia="Garamond" w:hAnsi="Garamond" w:cs="Garamond"/>
-          <w:sz w:val="21"/>
-          <w:szCs w:val="21"/>
-        </w:rPr>
-        <w:t xml:space="preserve"> and </w:t>
-      </w:r>
-      <w:proofErr w:type="spellStart"/>
-      <w:r>
-        <w:rPr>
-          <w:rFonts w:ascii="Garamond" w:eastAsia="Garamond" w:hAnsi="Garamond" w:cs="Garamond"/>
-          <w:sz w:val="21"/>
-          <w:szCs w:val="21"/>
-        </w:rPr>
-        <w:t>CodeChef</w:t>
-      </w:r>
-      <w:proofErr w:type="spellEnd"/>
-      <w:r>
-        <w:rPr>
-          <w:rFonts w:ascii="Garamond" w:eastAsia="Garamond" w:hAnsi="Garamond" w:cs="Garamond"/>
-          <w:sz w:val="21"/>
-          <w:szCs w:val="21"/>
-        </w:rPr>
-        <w:t xml:space="preserve"> contests; placed in the top 10% of a national collegiate programming competition</w:t>
-      </w:r>
-    </w:p>
-    <w:p>
-      <w:pPr>
-        <w:pBdr>
-          <w:top w:val="nil"/>
-          <w:left w:val="nil"/>
-          <w:bottom w:val="nil"/>
-          <w:right w:val="nil"/>
-          <w:between w:val="nil"/>
-        </w:pBdr>
-        <w:tabs>
-          <w:tab w:val="left" w:pos="284"/>
-          <w:tab w:val="left" w:pos="630"/>
-          <w:tab w:val="left" w:pos="900"/>
-        </w:tabs>
-        <w:ind w:left="-706"/>
-        <w:rPr>
-          <w:rFonts w:ascii="Garamond" w:eastAsia="Garamond" w:hAnsi="Garamond" w:cs="Garamond"/>
-          <w:color w:val="000000"/>
-          <w:sz w:val="21"/>
-          <w:szCs w:val="21"/>
-        </w:rPr>
-      </w:pPr>
-    </w:p>
-    <w:p>
-      <w:pPr>
-        <w:pBdr>
-          <w:bottom w:val="single" w:sz="6" w:space="1" w:color="000000"/>
-        </w:pBdr>
-        <w:tabs>
-          <w:tab w:val="left" w:pos="900"/>
-        </w:tabs>
-        <w:rPr>
-          <w:rFonts w:ascii="Garamond" w:eastAsia="Garamond" w:hAnsi="Garamond" w:cs="Garamond"/>
-          <w:sz w:val="21"/>
-          <w:szCs w:val="21"/>
-        </w:rPr>
-      </w:pPr>
-      <w:r>
-        <w:rPr>
-          <w:rFonts w:ascii="Garamond" w:eastAsia="Garamond" w:hAnsi="Garamond" w:cs="Garamond"/>
-          <w:b/>
-          <w:bCs/>
-          <w:color w:val="404040"/>
-          <w:sz w:val="22"/>
-          <w:szCs w:val="22"/>
-        </w:rPr>
-        <w:t>ADDITIONAL</w:t>
-      </w:r>
-      <w:r>
-        <w:rPr>
-          <w:rFonts w:ascii="Garamond" w:eastAsia="Garamond" w:hAnsi="Garamond" w:cs="Garamond"/>
-          <w:sz w:val="21"/>
-          <w:szCs w:val="21"/>
-        </w:rPr>
-        <w:tab/>
-      </w:r>
-    </w:p>
-    <w:p>
-      <w:pPr>
-        <w:tabs>
-          <w:tab w:val="left" w:pos="630"/>
-          <w:tab w:val="left" w:pos="900"/>
-        </w:tabs>
-        <w:rPr>
-          <w:rFonts w:ascii="Garamond" w:eastAsia="Garamond" w:hAnsi="Garamond" w:cs="Garamond"/>
-          <w:sz w:val="4"/>
-          <w:szCs w:val="4"/>
-        </w:rPr>
-      </w:pPr>
-    </w:p>
-    <w:p>
-      <w:pPr>
-        <w:tabs>
-          <w:tab w:val="left" w:pos="630"/>
-          <w:tab w:val="left" w:pos="900"/>
-        </w:tabs>
-        <w:rPr>
-          <w:rFonts w:ascii="Garamond" w:eastAsia="Garamond" w:hAnsi="Garamond" w:cs="Garamond"/>
-          <w:sz w:val="6"/>
-          <w:szCs w:val="6"/>
-        </w:rPr>
-      </w:pPr>
-    </w:p>
-    <w:p>
-      <w:pPr>
-        <w:tabs>
-          <w:tab w:val="left" w:pos="630"/>
-          <w:tab w:val="left" w:pos="900"/>
-        </w:tabs>
-        <w:rPr>
-          <w:rFonts w:ascii="Garamond" w:eastAsia="Garamond" w:hAnsi="Garamond" w:cs="Garamond"/>
-          <w:sz w:val="21"/>
-          <w:szCs w:val="21"/>
-        </w:rPr>
-      </w:pPr>
-      <w:r>
-        <w:rPr>
-          <w:rFonts w:ascii="Garamond" w:eastAsia="Garamond" w:hAnsi="Garamond" w:cs="Garamond"/>
-          <w:b/>
-          <w:bCs/>
-          <w:sz w:val="21"/>
-          <w:szCs w:val="21"/>
-        </w:rPr>
-        <w:t>Technical Skills</w:t>
-      </w:r>
-      <w:r>
-        <w:rPr>
-          <w:rFonts w:ascii="Garamond" w:eastAsia="Garamond" w:hAnsi="Garamond" w:cs="Garamond"/>
-          <w:sz w:val="21"/>
-          <w:szCs w:val="21"/>
-        </w:rPr>
-        <w:t>: Proficient in JavaScript/TypeScript, PHP (Laravel), React,</w:t>
-      </w:r>
-      <w:r>
-        <w:rPr>
-          <w:rFonts w:ascii="Garamond" w:eastAsia="Garamond" w:hAnsi="Garamond" w:cs="Garamond"/>
-          <w:sz w:val="21"/>
-          <w:szCs w:val="21"/>
-        </w:rPr>
-        <w:t xml:space="preserve"> </w:t>
-      </w:r>
-      <w:r>
-        <w:rPr>
-          <w:rFonts w:ascii="Garamond" w:eastAsia="Garamond" w:hAnsi="Garamond" w:cs="Garamond"/>
-          <w:sz w:val="21"/>
-          <w:szCs w:val="21"/>
-        </w:rPr>
-        <w:t>MySQL, HTML/CSS; Familiar with Python, Git, Docker</w:t>
-      </w:r>
-      <w:r>
-        <w:rPr>
-          <w:rFonts w:ascii="Garamond" w:eastAsia="Garamond" w:hAnsi="Garamond" w:cs="Garamond"/>
-          <w:sz w:val="21"/>
-          <w:szCs w:val="21"/>
-        </w:rPr>
-        <w:t xml:space="preserve"> and</w:t>
-      </w:r>
-      <w:r>
-        <w:rPr>
-          <w:rFonts w:ascii="Garamond" w:eastAsia="Garamond" w:hAnsi="Garamond" w:cs="Garamond"/>
-          <w:sz w:val="21"/>
-          <w:szCs w:val="21"/>
-        </w:rPr>
-        <w:t xml:space="preserve"> REST APIs</w:t>
-      </w:r>
-    </w:p>
-    <w:p>
-      <w:pPr>
-        <w:tabs>
-          <w:tab w:val="left" w:pos="630"/>
-          <w:tab w:val="left" w:pos="900"/>
-        </w:tabs>
-        <w:rPr>
-          <w:rFonts w:ascii="Garamond" w:eastAsia="Garamond" w:hAnsi="Garamond" w:cs="Garamond"/>
-          <w:b/>
-          <w:bCs/>
-          <w:sz w:val="21"/>
-          <w:szCs w:val="21"/>
-        </w:rPr>
-      </w:pPr>
-      <w:r>
-        <w:rPr>
-          <w:rFonts w:ascii="Garamond" w:eastAsia="Garamond" w:hAnsi="Garamond" w:cs="Garamond"/>
-          <w:b/>
-          <w:bCs/>
-          <w:sz w:val="21"/>
-          <w:szCs w:val="21"/>
-        </w:rPr>
         <w:t xml:space="preserve">Certifications: </w:t>
       </w:r>
       <w:r>
@@ -1808,51 +1318,15 @@
           <w:sz w:val="21"/>
           <w:szCs w:val="21"/>
         </w:rPr>
-        <w:t xml:space="preserve">AWS Certified Cloud Practitioner; </w:t>
-      </w:r>
-      <w:proofErr w:type="spellStart"/>
-      <w:r>
-        <w:rPr>
-          <w:rFonts w:ascii="Garamond" w:eastAsia="Garamond" w:hAnsi="Garamond" w:cs="Garamond"/>
-          <w:sz w:val="21"/>
-          <w:szCs w:val="21"/>
-        </w:rPr>
-        <w:t>freeCodeCamp</w:t>
-      </w:r>
-      <w:proofErr w:type="spellEnd"/>
-      <w:r>
-        <w:rPr>
-          <w:rFonts w:ascii="Garamond" w:eastAsia="Garamond" w:hAnsi="Garamond" w:cs="Garamond"/>
-          <w:sz w:val="21"/>
-          <w:szCs w:val="21"/>
-        </w:rPr>
-        <w:t xml:space="preserve"> – Full-Stack Web </w:t>
-      </w:r>
-      <w:proofErr w:type="gramStart"/>
-      <w:r>
-        <w:rPr>
-          <w:rFonts w:ascii="Garamond" w:eastAsia="Garamond" w:hAnsi="Garamond" w:cs="Garamond"/>
-          <w:sz w:val="21"/>
-          <w:szCs w:val="21"/>
-        </w:rPr>
-        <w:t>Development  ·</w:t>
-      </w:r>
-      <w:proofErr w:type="gramEnd"/>
-      <w:r>
-        <w:rPr>
-          <w:rFonts w:ascii="Garamond" w:eastAsia="Garamond" w:hAnsi="Garamond" w:cs="Garamond"/>
-          <w:sz w:val="21"/>
-          <w:szCs w:val="21"/>
-        </w:rPr>
-        <w:t xml:space="preserve">  Languages: English (fluent), Filipino (native)</w:t>
-      </w:r>
-      <w:r>
-        <w:rPr>
-          <w:rFonts w:ascii="Garamond" w:eastAsia="Garamond" w:hAnsi="Garamond" w:cs="Garamond"/>
-          <w:sz w:val="21"/>
-          <w:szCs w:val="21"/>
-        </w:rPr>
-        <w:br/>
+        <w:t>IT Specialist – HTML and CSS</w:t>
+      </w:r>
+      <w:r>
+        <w:rPr>
+          <w:rFonts w:ascii="Garamond" w:eastAsia="Garamond" w:hAnsi="Garamond" w:cs="Garamond"/>
+          <w:sz w:val="21"/>
+          <w:szCs w:val="21"/>
+        </w:rPr>
+        <w:t xml:space="preserve"> · Languages: English (fluent), Filipino (native)</w:t>
       </w:r>
     </w:p>
     <w:sectPr>
@@ -2515,6 +1989,7 @@
   <w:style w:type="character" w:default="1" w:styleId="DefaultParagraphFont">
     <w:name w:val="Default Paragraph Font"/>
     <w:uiPriority w:val="1"/>
+    <w:semiHidden/>
     <w:unhideWhenUsed/>
   </w:style>
   <w:style w:type="table" w:default="1" w:styleId="TableNormal">
@@ -2586,6 +2061,17 @@
       <w:sz w:val="48"/>
       <w:szCs w:val="48"/>
     </w:rPr>
+  </w:style>
+  <w:style w:type="paragraph" w:styleId="ListParagraph">
+    <w:name w:val="List Paragraph"/>
+    <w:basedOn w:val="Normal"/>
+    <w:uiPriority w:val="34"/>
+    <w:qFormat/>
+    <w:rsid w:val="00613119"/>
+    <w:pPr>
+      <w:ind w:left="720"/>
+      <w:contextualSpacing/>
+    </w:pPr>
   </w:style>
 </w:styles>
 </file>

</xml_diff>